<commit_message>
Update resume (PDF + Word) - 30 Oct 2026
</commit_message>
<xml_diff>
--- a/assets/Vijay-Kumar-Resume.docx
+++ b/assets/Vijay-Kumar-Resume.docx
@@ -143,33 +143,59 @@
         </w:rPr>
         <w:t xml:space="preserve"> </w:t>
       </w:r>
+      <w:r>
+        <w:fldChar w:fldCharType="begin"/>
+      </w:r>
+      <w:r>
+        <w:instrText>HYPERLINK "https://vijayxprty.github.io/vms/case-studies.html"</w:instrText>
+      </w:r>
+      <w:r>
+        <w:fldChar w:fldCharType="separate"/>
+      </w:r>
+      <w:r>
+        <w:rPr>
+          <w:rStyle w:val="Hyperlink"/>
+          <w:sz w:val="16"/>
+          <w:szCs w:val="16"/>
+        </w:rPr>
+        <w:t>Case Stu</w:t>
+      </w:r>
+      <w:r>
+        <w:rPr>
+          <w:rStyle w:val="Hyperlink"/>
+          <w:sz w:val="16"/>
+          <w:szCs w:val="16"/>
+        </w:rPr>
+        <w:t>d</w:t>
+      </w:r>
+      <w:r>
+        <w:rPr>
+          <w:rStyle w:val="Hyperlink"/>
+          <w:sz w:val="16"/>
+          <w:szCs w:val="16"/>
+        </w:rPr>
+        <w:t>ies</w:t>
+      </w:r>
+      <w:r>
+        <w:fldChar w:fldCharType="end"/>
+      </w:r>
+      <w:r>
+        <w:rPr>
+          <w:color w:val="1665C0"/>
+          <w:sz w:val="16"/>
+          <w:szCs w:val="16"/>
+        </w:rPr>
+        <w:t xml:space="preserve"> </w:t>
+      </w:r>
+      <w:r>
+        <w:rPr>
+          <w:color w:val="1665C0"/>
+          <w:sz w:val="16"/>
+          <w:szCs w:val="16"/>
+        </w:rPr>
+        <w:t xml:space="preserve">·  </w:t>
+      </w:r>
       <w:hyperlink r:id="rId6" w:history="1">
-        <w:r>
-          <w:rPr>
-            <w:rStyle w:val="Hyperlink"/>
-            <w:sz w:val="16"/>
-            <w:szCs w:val="16"/>
-          </w:rPr>
-          <w:t>Case Studies</w:t>
-        </w:r>
-      </w:hyperlink>
-      <w:r>
-        <w:rPr>
-          <w:color w:val="1665C0"/>
-          <w:sz w:val="16"/>
-          <w:szCs w:val="16"/>
-        </w:rPr>
-        <w:t xml:space="preserve"> </w:t>
-      </w:r>
-      <w:r>
-        <w:rPr>
-          <w:color w:val="1665C0"/>
-          <w:sz w:val="16"/>
-          <w:szCs w:val="16"/>
-        </w:rPr>
-        <w:t xml:space="preserve">·  </w:t>
-      </w:r>
-      <w:hyperlink r:id="rId7" w:history="1">
         <w:r>
           <w:rPr>
             <w:rStyle w:val="Hyperlink"/>
@@ -205,7 +231,7 @@
         </w:rPr>
         <w:t xml:space="preserve"> ·  </w:t>
       </w:r>
-      <w:hyperlink r:id="rId8" w:history="1">
+      <w:hyperlink r:id="rId7" w:history="1">
         <w:r>
           <w:rPr>
             <w:rStyle w:val="Hyperlink"/>
@@ -241,7 +267,7 @@
         </w:rPr>
         <w:t xml:space="preserve"> · </w:t>
       </w:r>
-      <w:hyperlink r:id="rId9" w:history="1">
+      <w:hyperlink r:id="rId8" w:history="1">
         <w:r>
           <w:rPr>
             <w:rStyle w:val="Hyperlink"/>
@@ -560,7 +586,7 @@
         </w:rPr>
         <w:t xml:space="preserve">Design for </w:t>
       </w:r>
-      <w:hyperlink r:id="rId10" w:history="1">
+      <w:hyperlink r:id="rId9" w:history="1">
         <w:r>
           <w:rPr>
             <w:rStyle w:val="Hyperlink"/>
@@ -1054,7 +1080,7 @@
         </w:rPr>
         <w:t xml:space="preserve">Served as sole designer on the complete digital overhaul of </w:t>
       </w:r>
-      <w:hyperlink r:id="rId11" w:history="1">
+      <w:hyperlink r:id="rId10" w:history="1">
         <w:r>
           <w:rPr>
             <w:rStyle w:val="Hyperlink"/>
@@ -1072,7 +1098,7 @@
         </w:rPr>
         <w:t xml:space="preserve"> — redesigning 8 digital platforms (</w:t>
       </w:r>
-      <w:hyperlink r:id="rId12" w:history="1">
+      <w:hyperlink r:id="rId11" w:history="1">
         <w:r>
           <w:rPr>
             <w:rStyle w:val="Hyperlink"/>
@@ -1090,7 +1116,7 @@
         </w:rPr>
         <w:t xml:space="preserve">, </w:t>
       </w:r>
-      <w:hyperlink r:id="rId13" w:history="1">
+      <w:hyperlink r:id="rId12" w:history="1">
         <w:r>
           <w:rPr>
             <w:rStyle w:val="Hyperlink"/>
@@ -1108,7 +1134,7 @@
         </w:rPr>
         <w:t xml:space="preserve">, </w:t>
       </w:r>
-      <w:hyperlink r:id="rId14" w:history="1">
+      <w:hyperlink r:id="rId13" w:history="1">
         <w:r>
           <w:rPr>
             <w:rStyle w:val="Hyperlink"/>
@@ -1126,7 +1152,7 @@
         </w:rPr>
         <w:t>, channel.equuscs.com</w:t>
       </w:r>
-      <w:hyperlink r:id="rId15" w:history="1">
+      <w:hyperlink r:id="rId14" w:history="1">
         <w:r>
           <w:rPr>
             <w:rStyle w:val="Hyperlink"/>
@@ -1136,7 +1162,7 @@
           <w:t>, rimage.com</w:t>
         </w:r>
       </w:hyperlink>
-      <w:hyperlink r:id="rId16" w:history="1">
+      <w:hyperlink r:id="rId15" w:history="1">
         <w:r>
           <w:rPr>
             <w:rStyle w:val="Hyperlink"/>
@@ -1154,7 +1180,7 @@
         </w:rPr>
         <w:t xml:space="preserve">, </w:t>
       </w:r>
-      <w:hyperlink r:id="rId17" w:history="1">
+      <w:hyperlink r:id="rId16" w:history="1">
         <w:r>
           <w:rPr>
             <w:rStyle w:val="Hyperlink"/>
@@ -1172,7 +1198,7 @@
         </w:rPr>
         <w:t xml:space="preserve">, and </w:t>
       </w:r>
-      <w:hyperlink r:id="rId18" w:history="1">
+      <w:hyperlink r:id="rId17" w:history="1">
         <w:r>
           <w:rPr>
             <w:rStyle w:val="Hyperlink"/>
@@ -1382,7 +1408,7 @@
         </w:rPr>
         <w:t xml:space="preserve">Led product design for </w:t>
       </w:r>
-      <w:hyperlink r:id="rId19" w:history="1">
+      <w:hyperlink r:id="rId18" w:history="1">
         <w:r>
           <w:rPr>
             <w:rStyle w:val="Hyperlink"/>
@@ -1492,7 +1518,7 @@
         </w:rPr>
         <w:t>Designed</w:t>
       </w:r>
-      <w:hyperlink r:id="rId20" w:history="1">
+      <w:hyperlink r:id="rId19" w:history="1">
         <w:r>
           <w:rPr>
             <w:rStyle w:val="Hyperlink"/>
@@ -1532,16 +1558,42 @@
         </w:rPr>
         <w:t xml:space="preserve">Led UI/UX design and frontend integration for </w:t>
       </w:r>
-      <w:hyperlink r:id="rId21" w:history="1">
-        <w:r>
-          <w:rPr>
-            <w:rStyle w:val="Hyperlink"/>
-            <w:sz w:val="16"/>
-            <w:szCs w:val="16"/>
-          </w:rPr>
-          <w:t>Bitclu.com</w:t>
-        </w:r>
-      </w:hyperlink>
+      <w:r>
+        <w:fldChar w:fldCharType="begin"/>
+      </w:r>
+      <w:r>
+        <w:instrText>HYPERLINK "https://vijayxprty.github.io/vms/bitclu.html"</w:instrText>
+      </w:r>
+      <w:r>
+        <w:fldChar w:fldCharType="separate"/>
+      </w:r>
+      <w:r>
+        <w:rPr>
+          <w:rStyle w:val="Hyperlink"/>
+          <w:sz w:val="16"/>
+          <w:szCs w:val="16"/>
+        </w:rPr>
+        <w:t>B</w:t>
+      </w:r>
+      <w:r>
+        <w:rPr>
+          <w:rStyle w:val="Hyperlink"/>
+          <w:sz w:val="16"/>
+          <w:szCs w:val="16"/>
+        </w:rPr>
+        <w:t>i</w:t>
+      </w:r>
+      <w:r>
+        <w:rPr>
+          <w:rStyle w:val="Hyperlink"/>
+          <w:sz w:val="16"/>
+          <w:szCs w:val="16"/>
+        </w:rPr>
+        <w:t>tclu.com</w:t>
+      </w:r>
+      <w:r>
+        <w:fldChar w:fldCharType="end"/>
+      </w:r>
       <w:r>
         <w:rPr>
           <w:color w:val="444444"/>
@@ -2311,7 +2363,7 @@
         </w:rPr>
         <w:t xml:space="preserve">  ·  </w:t>
       </w:r>
-      <w:hyperlink r:id="rId22" w:history="1">
+      <w:hyperlink r:id="rId20" w:history="1">
         <w:r>
           <w:rPr>
             <w:rStyle w:val="Hyperlink"/>
@@ -2404,7 +2456,7 @@
         </w:rPr>
         <w:t xml:space="preserve">  ·  </w:t>
       </w:r>
-      <w:hyperlink r:id="rId23" w:history="1">
+      <w:hyperlink r:id="rId21" w:history="1">
         <w:r>
           <w:rPr>
             <w:rStyle w:val="Hyperlink"/>
@@ -2422,7 +2474,7 @@
         </w:rPr>
         <w:t xml:space="preserve"> · </w:t>
       </w:r>
-      <w:hyperlink r:id="rId24" w:history="1">
+      <w:hyperlink r:id="rId22" w:history="1">
         <w:r>
           <w:rPr>
             <w:rStyle w:val="Hyperlink"/>
@@ -2440,7 +2492,7 @@
         </w:rPr>
         <w:t xml:space="preserve"> · </w:t>
       </w:r>
-      <w:hyperlink r:id="rId25" w:history="1">
+      <w:hyperlink r:id="rId23" w:history="1">
         <w:r>
           <w:rPr>
             <w:rStyle w:val="Hyperlink"/>
@@ -2513,7 +2565,7 @@
         </w:rPr>
         <w:t xml:space="preserve">  · </w:t>
       </w:r>
-      <w:hyperlink r:id="rId26" w:history="1">
+      <w:hyperlink r:id="rId24" w:history="1">
         <w:r>
           <w:rPr>
             <w:rStyle w:val="Hyperlink"/>
@@ -2598,7 +2650,7 @@
         </w:rPr>
         <w:t xml:space="preserve">  ·  </w:t>
       </w:r>
-      <w:hyperlink r:id="rId27" w:history="1">
+      <w:hyperlink r:id="rId25" w:history="1">
         <w:r>
           <w:rPr>
             <w:rStyle w:val="Hyperlink"/>
@@ -2711,7 +2763,7 @@
         </w:rPr>
         <w:t xml:space="preserve">  ·  </w:t>
       </w:r>
-      <w:hyperlink r:id="rId28" w:history="1">
+      <w:hyperlink r:id="rId26" w:history="1">
         <w:r>
           <w:rPr>
             <w:rStyle w:val="Hyperlink"/>

</xml_diff>